<commit_message>
Font Awesome icons are working fine now.
</commit_message>
<xml_diff>
--- a/docs/Project UI construction.docx
+++ b/docs/Project UI construction.docx
@@ -10,24 +10,14 @@
         <w:jc w:val="center"/>
       </w:pPr>
       <w:r>
-        <w:t xml:space="preserve">Project UI </w:t>
+        <w:t>Project UI construction</w:t>
       </w:r>
-      <w:proofErr w:type="spellStart"/>
       <w:r>
-        <w:t>construction</w:t>
-      </w:r>
-      <w:proofErr w:type="spellEnd"/>
-      <w:r>
-        <w:t xml:space="preserve"> </w:t>
-      </w:r>
-      <w:proofErr w:type="spellStart"/>
-      <w:r>
-        <w:t>d</w:t>
+        <w:t xml:space="preserve"> d</w:t>
       </w:r>
       <w:r>
         <w:t>ocumentation</w:t>
       </w:r>
-      <w:proofErr w:type="spellEnd"/>
       <w:r>
         <w:t>.</w:t>
       </w:r>
@@ -36,19 +26,9 @@
       <w:pPr>
         <w:jc w:val="center"/>
       </w:pPr>
-      <w:proofErr w:type="spellStart"/>
       <w:r>
-        <w:t>navigation</w:t>
+        <w:t>navigation bar component</w:t>
       </w:r>
-      <w:proofErr w:type="spellEnd"/>
-      <w:r>
-        <w:t xml:space="preserve"> bar </w:t>
-      </w:r>
-      <w:proofErr w:type="spellStart"/>
-      <w:r>
-        <w:t>component</w:t>
-      </w:r>
-      <w:proofErr w:type="spellEnd"/>
     </w:p>
     <w:p>
       <w:pPr>
@@ -70,7 +50,7 @@
           <w:noProof/>
         </w:rPr>
         <w:drawing>
-          <wp:anchor distT="0" distB="0" distL="114300" distR="114300" simplePos="0" relativeHeight="251658240" behindDoc="0" locked="0" layoutInCell="1" allowOverlap="1" wp14:anchorId="6A869C1C" wp14:editId="7A91C155">
+          <wp:anchor distT="0" distB="0" distL="114300" distR="114300" simplePos="0" relativeHeight="251658240" behindDoc="0" locked="0" layoutInCell="1" allowOverlap="1" wp14:anchorId="6A869C1C" wp14:editId="565D4D01">
             <wp:simplePos x="0" y="0"/>
             <wp:positionH relativeFrom="margin">
               <wp:align>center</wp:align>
@@ -79,7 +59,7 @@
               <wp:posOffset>1905</wp:posOffset>
             </wp:positionV>
             <wp:extent cx="2192655" cy="2437130"/>
-            <wp:effectExtent l="0" t="0" r="74295" b="1270"/>
+            <wp:effectExtent l="0" t="0" r="17145" b="1270"/>
             <wp:wrapSquare wrapText="bothSides"/>
             <wp:docPr id="1235623314" name="Diagram 1"/>
             <wp:cNvGraphicFramePr/>
@@ -834,6 +814,7 @@
   <w:style w:type="character" w:default="1" w:styleId="Bekezdsalapbettpusa">
     <w:name w:val="Default Paragraph Font"/>
     <w:uiPriority w:val="1"/>
+    <w:semiHidden/>
     <w:unhideWhenUsed/>
   </w:style>
   <w:style w:type="table" w:default="1" w:styleId="Normltblzat">
@@ -1964,7 +1945,7 @@
           </a:pPr>
           <a:r>
             <a:rPr lang="hu-HU" sz="1500"/>
-            <a:t>Logo component</a:t>
+            <a:t>Nav component</a:t>
           </a:r>
         </a:p>
       </dgm:t>
@@ -1982,88 +1963,6 @@
       </dgm:t>
     </dgm:pt>
     <dgm:pt modelId="{AB9057A1-E096-47E3-B317-FC435525CE6D}" type="sibTrans" cxnId="{6ED0D02C-E0D7-4647-9A72-6881AA14F4F0}">
-      <dgm:prSet/>
-      <dgm:spPr/>
-      <dgm:t>
-        <a:bodyPr/>
-        <a:lstStyle/>
-        <a:p>
-          <a:pPr algn="ctr"/>
-          <a:endParaRPr lang="hu-HU"/>
-        </a:p>
-      </dgm:t>
-    </dgm:pt>
-    <dgm:pt modelId="{B27619A3-AC0A-4A0E-A6AD-0D3390B63804}">
-      <dgm:prSet phldrT="[Szöveg]"/>
-      <dgm:spPr/>
-      <dgm:t>
-        <a:bodyPr/>
-        <a:lstStyle/>
-        <a:p>
-          <a:pPr algn="ctr">
-            <a:buNone/>
-          </a:pPr>
-          <a:r>
-            <a:rPr lang="hu-HU"/>
-            <a:t>menu component</a:t>
-          </a:r>
-        </a:p>
-      </dgm:t>
-    </dgm:pt>
-    <dgm:pt modelId="{2E8E434B-B4F9-42D6-8170-D1C497C43ED0}" type="parTrans" cxnId="{DA544565-BA87-4CF6-AC93-C73DF1F89B70}">
-      <dgm:prSet/>
-      <dgm:spPr/>
-      <dgm:t>
-        <a:bodyPr/>
-        <a:lstStyle/>
-        <a:p>
-          <a:pPr algn="ctr"/>
-          <a:endParaRPr lang="hu-HU"/>
-        </a:p>
-      </dgm:t>
-    </dgm:pt>
-    <dgm:pt modelId="{2A123477-7799-4FD3-BC65-2CFAB397DEF4}" type="sibTrans" cxnId="{DA544565-BA87-4CF6-AC93-C73DF1F89B70}">
-      <dgm:prSet/>
-      <dgm:spPr/>
-      <dgm:t>
-        <a:bodyPr/>
-        <a:lstStyle/>
-        <a:p>
-          <a:pPr algn="ctr"/>
-          <a:endParaRPr lang="hu-HU"/>
-        </a:p>
-      </dgm:t>
-    </dgm:pt>
-    <dgm:pt modelId="{705664D3-3B52-49E9-80AC-54C193BD7ED2}">
-      <dgm:prSet phldrT="[Szöveg]"/>
-      <dgm:spPr/>
-      <dgm:t>
-        <a:bodyPr/>
-        <a:lstStyle/>
-        <a:p>
-          <a:pPr algn="ctr">
-            <a:buNone/>
-          </a:pPr>
-          <a:r>
-            <a:rPr lang="hu-HU"/>
-            <a:t>Buttons component</a:t>
-          </a:r>
-        </a:p>
-      </dgm:t>
-    </dgm:pt>
-    <dgm:pt modelId="{40E51F7F-7BEE-4100-9631-07BD10438132}" type="parTrans" cxnId="{9275CA50-77DC-4C1C-B2D0-AF540A179A15}">
-      <dgm:prSet/>
-      <dgm:spPr/>
-      <dgm:t>
-        <a:bodyPr/>
-        <a:lstStyle/>
-        <a:p>
-          <a:pPr algn="ctr"/>
-          <a:endParaRPr lang="hu-HU"/>
-        </a:p>
-      </dgm:t>
-    </dgm:pt>
-    <dgm:pt modelId="{5407A497-F8C2-4357-900A-5B764DFD7EC5}" type="sibTrans" cxnId="{9275CA50-77DC-4C1C-B2D0-AF540A179A15}">
       <dgm:prSet/>
       <dgm:spPr/>
       <dgm:t>
@@ -2104,11 +2003,11 @@
       <dgm:spPr/>
     </dgm:pt>
     <dgm:pt modelId="{73D980F7-3BF9-44CA-A2A1-D5544661D970}" type="pres">
-      <dgm:prSet presAssocID="{A43BAEE8-CFF2-4536-8F55-D52B91285BD9}" presName="conn2-1" presStyleLbl="parChTrans1D2" presStyleIdx="0" presStyleCnt="3"/>
+      <dgm:prSet presAssocID="{A43BAEE8-CFF2-4536-8F55-D52B91285BD9}" presName="conn2-1" presStyleLbl="parChTrans1D2" presStyleIdx="0" presStyleCnt="1"/>
       <dgm:spPr/>
     </dgm:pt>
     <dgm:pt modelId="{97E65050-5A97-4BF0-8E96-424CAA7E6530}" type="pres">
-      <dgm:prSet presAssocID="{A43BAEE8-CFF2-4536-8F55-D52B91285BD9}" presName="connTx" presStyleLbl="parChTrans1D2" presStyleIdx="0" presStyleCnt="3"/>
+      <dgm:prSet presAssocID="{A43BAEE8-CFF2-4536-8F55-D52B91285BD9}" presName="connTx" presStyleLbl="parChTrans1D2" presStyleIdx="0" presStyleCnt="1"/>
       <dgm:spPr/>
     </dgm:pt>
     <dgm:pt modelId="{B20F748C-6ECB-47AE-8110-E02550BDE3C2}" type="pres">
@@ -2116,7 +2015,7 @@
       <dgm:spPr/>
     </dgm:pt>
     <dgm:pt modelId="{A28FB0BA-4FAA-4D08-A27E-6DCD79EFC2B7}" type="pres">
-      <dgm:prSet presAssocID="{D867E064-B150-4FE2-BE23-B8099D58ED82}" presName="LevelTwoTextNode" presStyleLbl="node2" presStyleIdx="0" presStyleCnt="3">
+      <dgm:prSet presAssocID="{D867E064-B150-4FE2-BE23-B8099D58ED82}" presName="LevelTwoTextNode" presStyleLbl="node2" presStyleIdx="0" presStyleCnt="1">
         <dgm:presLayoutVars>
           <dgm:chPref val="3"/>
         </dgm:presLayoutVars>
@@ -2127,71 +2026,15 @@
       <dgm:prSet presAssocID="{D867E064-B150-4FE2-BE23-B8099D58ED82}" presName="level3hierChild" presStyleCnt="0"/>
       <dgm:spPr/>
     </dgm:pt>
-    <dgm:pt modelId="{BEB6051D-3A27-42D4-A209-C74F89CFDD99}" type="pres">
-      <dgm:prSet presAssocID="{2E8E434B-B4F9-42D6-8170-D1C497C43ED0}" presName="conn2-1" presStyleLbl="parChTrans1D2" presStyleIdx="1" presStyleCnt="3"/>
-      <dgm:spPr/>
-    </dgm:pt>
-    <dgm:pt modelId="{49A44AFA-E9DA-4608-9B4E-80C503D5B67E}" type="pres">
-      <dgm:prSet presAssocID="{2E8E434B-B4F9-42D6-8170-D1C497C43ED0}" presName="connTx" presStyleLbl="parChTrans1D2" presStyleIdx="1" presStyleCnt="3"/>
-      <dgm:spPr/>
-    </dgm:pt>
-    <dgm:pt modelId="{6080545A-79EB-4EE3-A522-BEC82BC4CD5E}" type="pres">
-      <dgm:prSet presAssocID="{B27619A3-AC0A-4A0E-A6AD-0D3390B63804}" presName="root2" presStyleCnt="0"/>
-      <dgm:spPr/>
-    </dgm:pt>
-    <dgm:pt modelId="{899584F5-6BEA-409F-A46E-E06620EDDC06}" type="pres">
-      <dgm:prSet presAssocID="{B27619A3-AC0A-4A0E-A6AD-0D3390B63804}" presName="LevelTwoTextNode" presStyleLbl="node2" presStyleIdx="1" presStyleCnt="3">
-        <dgm:presLayoutVars>
-          <dgm:chPref val="3"/>
-        </dgm:presLayoutVars>
-      </dgm:prSet>
-      <dgm:spPr/>
-    </dgm:pt>
-    <dgm:pt modelId="{C07FDC26-C3F7-450A-B47B-6655E5C9CBC8}" type="pres">
-      <dgm:prSet presAssocID="{B27619A3-AC0A-4A0E-A6AD-0D3390B63804}" presName="level3hierChild" presStyleCnt="0"/>
-      <dgm:spPr/>
-    </dgm:pt>
-    <dgm:pt modelId="{EE52BFB5-DC95-4F1F-A399-1B584D47701C}" type="pres">
-      <dgm:prSet presAssocID="{40E51F7F-7BEE-4100-9631-07BD10438132}" presName="conn2-1" presStyleLbl="parChTrans1D2" presStyleIdx="2" presStyleCnt="3"/>
-      <dgm:spPr/>
-    </dgm:pt>
-    <dgm:pt modelId="{66B3BCA0-DABA-484A-BD3C-D653BC5683ED}" type="pres">
-      <dgm:prSet presAssocID="{40E51F7F-7BEE-4100-9631-07BD10438132}" presName="connTx" presStyleLbl="parChTrans1D2" presStyleIdx="2" presStyleCnt="3"/>
-      <dgm:spPr/>
-    </dgm:pt>
-    <dgm:pt modelId="{55F4D256-92E1-40B0-AB33-7785F78B10C9}" type="pres">
-      <dgm:prSet presAssocID="{705664D3-3B52-49E9-80AC-54C193BD7ED2}" presName="root2" presStyleCnt="0"/>
-      <dgm:spPr/>
-    </dgm:pt>
-    <dgm:pt modelId="{C852B576-2FDC-4FCF-B74B-D2A846C1387C}" type="pres">
-      <dgm:prSet presAssocID="{705664D3-3B52-49E9-80AC-54C193BD7ED2}" presName="LevelTwoTextNode" presStyleLbl="node2" presStyleIdx="2" presStyleCnt="3">
-        <dgm:presLayoutVars>
-          <dgm:chPref val="3"/>
-        </dgm:presLayoutVars>
-      </dgm:prSet>
-      <dgm:spPr/>
-    </dgm:pt>
-    <dgm:pt modelId="{2885BCB6-432F-4340-A404-773F8E419126}" type="pres">
-      <dgm:prSet presAssocID="{705664D3-3B52-49E9-80AC-54C193BD7ED2}" presName="level3hierChild" presStyleCnt="0"/>
-      <dgm:spPr/>
-    </dgm:pt>
   </dgm:ptLst>
   <dgm:cxnLst>
     <dgm:cxn modelId="{6ED0D02C-E0D7-4647-9A72-6881AA14F4F0}" srcId="{D81F8FA0-C09B-4028-890B-F694F71BA3C6}" destId="{D867E064-B150-4FE2-BE23-B8099D58ED82}" srcOrd="0" destOrd="0" parTransId="{A43BAEE8-CFF2-4536-8F55-D52B91285BD9}" sibTransId="{AB9057A1-E096-47E3-B317-FC435525CE6D}"/>
-    <dgm:cxn modelId="{C1158336-34A4-4E1D-804D-CD8F5D763F43}" type="presOf" srcId="{40E51F7F-7BEE-4100-9631-07BD10438132}" destId="{66B3BCA0-DABA-484A-BD3C-D653BC5683ED}" srcOrd="1" destOrd="0" presId="urn:microsoft.com/office/officeart/2008/layout/HorizontalMultiLevelHierarchy"/>
     <dgm:cxn modelId="{C8F60138-B6CF-424E-9F9D-F3C0B16DB37C}" type="presOf" srcId="{D867E064-B150-4FE2-BE23-B8099D58ED82}" destId="{A28FB0BA-4FAA-4D08-A27E-6DCD79EFC2B7}" srcOrd="0" destOrd="0" presId="urn:microsoft.com/office/officeart/2008/layout/HorizontalMultiLevelHierarchy"/>
-    <dgm:cxn modelId="{DA544565-BA87-4CF6-AC93-C73DF1F89B70}" srcId="{D81F8FA0-C09B-4028-890B-F694F71BA3C6}" destId="{B27619A3-AC0A-4A0E-A6AD-0D3390B63804}" srcOrd="1" destOrd="0" parTransId="{2E8E434B-B4F9-42D6-8170-D1C497C43ED0}" sibTransId="{2A123477-7799-4FD3-BC65-2CFAB397DEF4}"/>
     <dgm:cxn modelId="{CAC5BD70-D264-4AA9-9AA0-D7255C7E83DE}" srcId="{B70CF952-CE16-4479-915F-2B83B7DC6815}" destId="{D81F8FA0-C09B-4028-890B-F694F71BA3C6}" srcOrd="0" destOrd="0" parTransId="{C51DD6BC-5B59-4719-8448-DFB1C945464F}" sibTransId="{8DC414D8-9097-4B19-BDA5-6204ECDEE2C1}"/>
-    <dgm:cxn modelId="{9275CA50-77DC-4C1C-B2D0-AF540A179A15}" srcId="{D81F8FA0-C09B-4028-890B-F694F71BA3C6}" destId="{705664D3-3B52-49E9-80AC-54C193BD7ED2}" srcOrd="2" destOrd="0" parTransId="{40E51F7F-7BEE-4100-9631-07BD10438132}" sibTransId="{5407A497-F8C2-4357-900A-5B764DFD7EC5}"/>
-    <dgm:cxn modelId="{FB2CD88E-D62E-4C46-9656-BA8128D944E7}" type="presOf" srcId="{2E8E434B-B4F9-42D6-8170-D1C497C43ED0}" destId="{BEB6051D-3A27-42D4-A209-C74F89CFDD99}" srcOrd="0" destOrd="0" presId="urn:microsoft.com/office/officeart/2008/layout/HorizontalMultiLevelHierarchy"/>
     <dgm:cxn modelId="{E4BAFA90-D95F-4CBF-9CB4-087A72D00EAE}" type="presOf" srcId="{B70CF952-CE16-4479-915F-2B83B7DC6815}" destId="{87B6C78E-66D3-4102-8CDB-9D262C8AFDF1}" srcOrd="0" destOrd="0" presId="urn:microsoft.com/office/officeart/2008/layout/HorizontalMultiLevelHierarchy"/>
-    <dgm:cxn modelId="{341F2F91-B9C3-444B-B6D2-FE8B8B92E7BD}" type="presOf" srcId="{B27619A3-AC0A-4A0E-A6AD-0D3390B63804}" destId="{899584F5-6BEA-409F-A46E-E06620EDDC06}" srcOrd="0" destOrd="0" presId="urn:microsoft.com/office/officeart/2008/layout/HorizontalMultiLevelHierarchy"/>
     <dgm:cxn modelId="{4E96C5A9-E77C-46D3-9F40-C3C25FB52F73}" type="presOf" srcId="{D81F8FA0-C09B-4028-890B-F694F71BA3C6}" destId="{13257E80-9240-4EF7-BC81-454A0D2522E8}" srcOrd="0" destOrd="0" presId="urn:microsoft.com/office/officeart/2008/layout/HorizontalMultiLevelHierarchy"/>
-    <dgm:cxn modelId="{EBBA7CB6-739C-4442-AE87-1DE000151C84}" type="presOf" srcId="{705664D3-3B52-49E9-80AC-54C193BD7ED2}" destId="{C852B576-2FDC-4FCF-B74B-D2A846C1387C}" srcOrd="0" destOrd="0" presId="urn:microsoft.com/office/officeart/2008/layout/HorizontalMultiLevelHierarchy"/>
     <dgm:cxn modelId="{16920BBF-82AB-46A3-A493-18CA9496F193}" type="presOf" srcId="{A43BAEE8-CFF2-4536-8F55-D52B91285BD9}" destId="{97E65050-5A97-4BF0-8E96-424CAA7E6530}" srcOrd="1" destOrd="0" presId="urn:microsoft.com/office/officeart/2008/layout/HorizontalMultiLevelHierarchy"/>
-    <dgm:cxn modelId="{1D1E9DCE-DB46-4020-84A8-06B5490708A3}" type="presOf" srcId="{2E8E434B-B4F9-42D6-8170-D1C497C43ED0}" destId="{49A44AFA-E9DA-4608-9B4E-80C503D5B67E}" srcOrd="1" destOrd="0" presId="urn:microsoft.com/office/officeart/2008/layout/HorizontalMultiLevelHierarchy"/>
     <dgm:cxn modelId="{F611A5D6-4B4E-4062-B789-F5B7E7BABDEE}" type="presOf" srcId="{A43BAEE8-CFF2-4536-8F55-D52B91285BD9}" destId="{73D980F7-3BF9-44CA-A2A1-D5544661D970}" srcOrd="0" destOrd="0" presId="urn:microsoft.com/office/officeart/2008/layout/HorizontalMultiLevelHierarchy"/>
-    <dgm:cxn modelId="{CDD6B9D8-89B0-43F5-83EC-39286A0083E2}" type="presOf" srcId="{40E51F7F-7BEE-4100-9631-07BD10438132}" destId="{EE52BFB5-DC95-4F1F-A399-1B584D47701C}" srcOrd="0" destOrd="0" presId="urn:microsoft.com/office/officeart/2008/layout/HorizontalMultiLevelHierarchy"/>
     <dgm:cxn modelId="{0233C1B7-DA21-4657-9185-50FF257B0136}" type="presParOf" srcId="{87B6C78E-66D3-4102-8CDB-9D262C8AFDF1}" destId="{BFF30459-64F1-4254-AA46-A15FA432909B}" srcOrd="0" destOrd="0" presId="urn:microsoft.com/office/officeart/2008/layout/HorizontalMultiLevelHierarchy"/>
     <dgm:cxn modelId="{8B21B249-EFD0-497C-8C40-11BB656237B5}" type="presParOf" srcId="{BFF30459-64F1-4254-AA46-A15FA432909B}" destId="{13257E80-9240-4EF7-BC81-454A0D2522E8}" srcOrd="0" destOrd="0" presId="urn:microsoft.com/office/officeart/2008/layout/HorizontalMultiLevelHierarchy"/>
     <dgm:cxn modelId="{61F7D7B1-9DEB-483F-809B-CA70C5D6A644}" type="presParOf" srcId="{BFF30459-64F1-4254-AA46-A15FA432909B}" destId="{75DDDF1B-B89C-418C-90C1-3F6F32C4C46E}" srcOrd="1" destOrd="0" presId="urn:microsoft.com/office/officeart/2008/layout/HorizontalMultiLevelHierarchy"/>
@@ -2200,16 +2043,6 @@
     <dgm:cxn modelId="{897B33B0-8522-4388-A13A-BDBD6A4CE736}" type="presParOf" srcId="{75DDDF1B-B89C-418C-90C1-3F6F32C4C46E}" destId="{B20F748C-6ECB-47AE-8110-E02550BDE3C2}" srcOrd="1" destOrd="0" presId="urn:microsoft.com/office/officeart/2008/layout/HorizontalMultiLevelHierarchy"/>
     <dgm:cxn modelId="{E4BBC823-42BF-4128-90C2-9775035EB37F}" type="presParOf" srcId="{B20F748C-6ECB-47AE-8110-E02550BDE3C2}" destId="{A28FB0BA-4FAA-4D08-A27E-6DCD79EFC2B7}" srcOrd="0" destOrd="0" presId="urn:microsoft.com/office/officeart/2008/layout/HorizontalMultiLevelHierarchy"/>
     <dgm:cxn modelId="{2ED671B8-5749-4C50-B314-C507B7295CF7}" type="presParOf" srcId="{B20F748C-6ECB-47AE-8110-E02550BDE3C2}" destId="{C2C5FC77-3DAD-4F5A-803F-05CD432B45F6}" srcOrd="1" destOrd="0" presId="urn:microsoft.com/office/officeart/2008/layout/HorizontalMultiLevelHierarchy"/>
-    <dgm:cxn modelId="{341B0DFF-6C3A-4765-801D-1A143331C0BC}" type="presParOf" srcId="{75DDDF1B-B89C-418C-90C1-3F6F32C4C46E}" destId="{BEB6051D-3A27-42D4-A209-C74F89CFDD99}" srcOrd="2" destOrd="0" presId="urn:microsoft.com/office/officeart/2008/layout/HorizontalMultiLevelHierarchy"/>
-    <dgm:cxn modelId="{F4927655-BA4F-4290-9887-280C2EC1C78E}" type="presParOf" srcId="{BEB6051D-3A27-42D4-A209-C74F89CFDD99}" destId="{49A44AFA-E9DA-4608-9B4E-80C503D5B67E}" srcOrd="0" destOrd="0" presId="urn:microsoft.com/office/officeart/2008/layout/HorizontalMultiLevelHierarchy"/>
-    <dgm:cxn modelId="{D2716BEC-192B-4FCC-B3B4-A1D572793C80}" type="presParOf" srcId="{75DDDF1B-B89C-418C-90C1-3F6F32C4C46E}" destId="{6080545A-79EB-4EE3-A522-BEC82BC4CD5E}" srcOrd="3" destOrd="0" presId="urn:microsoft.com/office/officeart/2008/layout/HorizontalMultiLevelHierarchy"/>
-    <dgm:cxn modelId="{BD3BDFD1-7882-4DAC-93F6-2C6201DE1014}" type="presParOf" srcId="{6080545A-79EB-4EE3-A522-BEC82BC4CD5E}" destId="{899584F5-6BEA-409F-A46E-E06620EDDC06}" srcOrd="0" destOrd="0" presId="urn:microsoft.com/office/officeart/2008/layout/HorizontalMultiLevelHierarchy"/>
-    <dgm:cxn modelId="{A7323A42-5726-426D-920F-A3C5DA76CD8C}" type="presParOf" srcId="{6080545A-79EB-4EE3-A522-BEC82BC4CD5E}" destId="{C07FDC26-C3F7-450A-B47B-6655E5C9CBC8}" srcOrd="1" destOrd="0" presId="urn:microsoft.com/office/officeart/2008/layout/HorizontalMultiLevelHierarchy"/>
-    <dgm:cxn modelId="{5A09F27F-A7E0-40FA-B08B-A5BE6D78E4FF}" type="presParOf" srcId="{75DDDF1B-B89C-418C-90C1-3F6F32C4C46E}" destId="{EE52BFB5-DC95-4F1F-A399-1B584D47701C}" srcOrd="4" destOrd="0" presId="urn:microsoft.com/office/officeart/2008/layout/HorizontalMultiLevelHierarchy"/>
-    <dgm:cxn modelId="{F5A6356F-D714-4996-8CF1-1C1594D4E679}" type="presParOf" srcId="{EE52BFB5-DC95-4F1F-A399-1B584D47701C}" destId="{66B3BCA0-DABA-484A-BD3C-D653BC5683ED}" srcOrd="0" destOrd="0" presId="urn:microsoft.com/office/officeart/2008/layout/HorizontalMultiLevelHierarchy"/>
-    <dgm:cxn modelId="{F315AA82-6698-4D88-B599-F1B2C274A664}" type="presParOf" srcId="{75DDDF1B-B89C-418C-90C1-3F6F32C4C46E}" destId="{55F4D256-92E1-40B0-AB33-7785F78B10C9}" srcOrd="5" destOrd="0" presId="urn:microsoft.com/office/officeart/2008/layout/HorizontalMultiLevelHierarchy"/>
-    <dgm:cxn modelId="{ECA2EBC0-A97D-4504-A16F-6EDA239946E2}" type="presParOf" srcId="{55F4D256-92E1-40B0-AB33-7785F78B10C9}" destId="{C852B576-2FDC-4FCF-B74B-D2A846C1387C}" srcOrd="0" destOrd="0" presId="urn:microsoft.com/office/officeart/2008/layout/HorizontalMultiLevelHierarchy"/>
-    <dgm:cxn modelId="{EFF7490D-EC29-49D4-8D64-07ED8C977D02}" type="presParOf" srcId="{55F4D256-92E1-40B0-AB33-7785F78B10C9}" destId="{2885BCB6-432F-4340-A404-773F8E419126}" srcOrd="1" destOrd="0" presId="urn:microsoft.com/office/officeart/2008/layout/HorizontalMultiLevelHierarchy"/>
   </dgm:cxnLst>
   <dgm:bg/>
   <dgm:whole/>
@@ -2229,94 +2062,7 @@
       <dsp:cNvGrpSpPr/>
     </dsp:nvGrpSpPr>
     <dsp:grpSpPr/>
-    <dsp:sp modelId="{EE52BFB5-DC95-4F1F-A399-1B584D47701C}">
-      <dsp:nvSpPr>
-        <dsp:cNvPr id="0" name=""/>
-        <dsp:cNvSpPr/>
-      </dsp:nvSpPr>
-      <dsp:spPr>
-        <a:xfrm>
-          <a:off x="444444" y="1218565"/>
-          <a:ext cx="291304" cy="555077"/>
-        </a:xfrm>
-        <a:custGeom>
-          <a:avLst/>
-          <a:gdLst/>
-          <a:ahLst/>
-          <a:cxnLst/>
-          <a:rect l="0" t="0" r="0" b="0"/>
-          <a:pathLst>
-            <a:path>
-              <a:moveTo>
-                <a:pt x="0" y="0"/>
-              </a:moveTo>
-              <a:lnTo>
-                <a:pt x="145652" y="0"/>
-              </a:lnTo>
-              <a:lnTo>
-                <a:pt x="145652" y="555077"/>
-              </a:lnTo>
-              <a:lnTo>
-                <a:pt x="291304" y="555077"/>
-              </a:lnTo>
-            </a:path>
-          </a:pathLst>
-        </a:custGeom>
-        <a:noFill/>
-        <a:ln w="12700" cap="flat" cmpd="sng" algn="ctr">
-          <a:solidFill>
-            <a:schemeClr val="accent1">
-              <a:shade val="60000"/>
-              <a:hueOff val="0"/>
-              <a:satOff val="0"/>
-              <a:lumOff val="0"/>
-              <a:alphaOff val="0"/>
-            </a:schemeClr>
-          </a:solidFill>
-          <a:prstDash val="solid"/>
-          <a:miter lim="800000"/>
-        </a:ln>
-        <a:effectLst/>
-      </dsp:spPr>
-      <dsp:style>
-        <a:lnRef idx="2">
-          <a:scrgbClr r="0" g="0" b="0"/>
-        </a:lnRef>
-        <a:fillRef idx="0">
-          <a:scrgbClr r="0" g="0" b="0"/>
-        </a:fillRef>
-        <a:effectRef idx="0">
-          <a:scrgbClr r="0" g="0" b="0"/>
-        </a:effectRef>
-        <a:fontRef idx="minor"/>
-      </dsp:style>
-      <dsp:txBody>
-        <a:bodyPr spcFirstLastPara="0" vert="horz" wrap="square" lIns="12700" tIns="0" rIns="12700" bIns="0" numCol="1" spcCol="1270" anchor="ctr" anchorCtr="0">
-          <a:noAutofit/>
-        </a:bodyPr>
-        <a:lstStyle/>
-        <a:p>
-          <a:pPr marL="0" lvl="0" indent="0" algn="ctr" defTabSz="222250">
-            <a:lnSpc>
-              <a:spcPct val="90000"/>
-            </a:lnSpc>
-            <a:spcBef>
-              <a:spcPct val="0"/>
-            </a:spcBef>
-            <a:spcAft>
-              <a:spcPct val="35000"/>
-            </a:spcAft>
-            <a:buNone/>
-          </a:pPr>
-          <a:endParaRPr lang="hu-HU" sz="500" kern="1200"/>
-        </a:p>
-      </dsp:txBody>
-      <dsp:txXfrm>
-        <a:off x="574424" y="1480432"/>
-        <a:ext cx="31343" cy="31343"/>
-      </dsp:txXfrm>
-    </dsp:sp>
-    <dsp:sp modelId="{BEB6051D-3A27-42D4-A209-C74F89CFDD99}">
+    <dsp:sp modelId="{73D980F7-3BF9-44CA-A2A1-D5544661D970}">
       <dsp:nvSpPr>
         <dsp:cNvPr id="0" name=""/>
         <dsp:cNvSpPr/>
@@ -2395,93 +2141,6 @@
       <dsp:txXfrm>
         <a:off x="582813" y="1211282"/>
         <a:ext cx="14565" cy="14565"/>
-      </dsp:txXfrm>
-    </dsp:sp>
-    <dsp:sp modelId="{73D980F7-3BF9-44CA-A2A1-D5544661D970}">
-      <dsp:nvSpPr>
-        <dsp:cNvPr id="0" name=""/>
-        <dsp:cNvSpPr/>
-      </dsp:nvSpPr>
-      <dsp:spPr>
-        <a:xfrm>
-          <a:off x="444444" y="663487"/>
-          <a:ext cx="291304" cy="555077"/>
-        </a:xfrm>
-        <a:custGeom>
-          <a:avLst/>
-          <a:gdLst/>
-          <a:ahLst/>
-          <a:cxnLst/>
-          <a:rect l="0" t="0" r="0" b="0"/>
-          <a:pathLst>
-            <a:path>
-              <a:moveTo>
-                <a:pt x="0" y="555077"/>
-              </a:moveTo>
-              <a:lnTo>
-                <a:pt x="145652" y="555077"/>
-              </a:lnTo>
-              <a:lnTo>
-                <a:pt x="145652" y="0"/>
-              </a:lnTo>
-              <a:lnTo>
-                <a:pt x="291304" y="0"/>
-              </a:lnTo>
-            </a:path>
-          </a:pathLst>
-        </a:custGeom>
-        <a:noFill/>
-        <a:ln w="12700" cap="flat" cmpd="sng" algn="ctr">
-          <a:solidFill>
-            <a:schemeClr val="accent1">
-              <a:shade val="60000"/>
-              <a:hueOff val="0"/>
-              <a:satOff val="0"/>
-              <a:lumOff val="0"/>
-              <a:alphaOff val="0"/>
-            </a:schemeClr>
-          </a:solidFill>
-          <a:prstDash val="solid"/>
-          <a:miter lim="800000"/>
-        </a:ln>
-        <a:effectLst/>
-      </dsp:spPr>
-      <dsp:style>
-        <a:lnRef idx="2">
-          <a:scrgbClr r="0" g="0" b="0"/>
-        </a:lnRef>
-        <a:fillRef idx="0">
-          <a:scrgbClr r="0" g="0" b="0"/>
-        </a:fillRef>
-        <a:effectRef idx="0">
-          <a:scrgbClr r="0" g="0" b="0"/>
-        </a:effectRef>
-        <a:fontRef idx="minor"/>
-      </dsp:style>
-      <dsp:txBody>
-        <a:bodyPr spcFirstLastPara="0" vert="horz" wrap="square" lIns="12700" tIns="0" rIns="12700" bIns="0" numCol="1" spcCol="1270" anchor="ctr" anchorCtr="0">
-          <a:noAutofit/>
-        </a:bodyPr>
-        <a:lstStyle/>
-        <a:p>
-          <a:pPr marL="0" lvl="0" indent="0" algn="ctr" defTabSz="222250">
-            <a:lnSpc>
-              <a:spcPct val="90000"/>
-            </a:lnSpc>
-            <a:spcBef>
-              <a:spcPct val="0"/>
-            </a:spcBef>
-            <a:spcAft>
-              <a:spcPct val="35000"/>
-            </a:spcAft>
-            <a:buNone/>
-          </a:pPr>
-          <a:endParaRPr lang="hu-HU" sz="500" kern="1200"/>
-        </a:p>
-      </dsp:txBody>
-      <dsp:txXfrm>
-        <a:off x="574424" y="925354"/>
-        <a:ext cx="31343" cy="31343"/>
       </dsp:txXfrm>
     </dsp:sp>
     <dsp:sp modelId="{13257E80-9240-4EF7-BC81-454A0D2522E8}">
@@ -2569,84 +2228,6 @@
       </dsp:nvSpPr>
       <dsp:spPr>
         <a:xfrm>
-          <a:off x="735748" y="441456"/>
-          <a:ext cx="1456524" cy="444062"/>
-        </a:xfrm>
-        <a:prstGeom prst="rect">
-          <a:avLst/>
-        </a:prstGeom>
-        <a:solidFill>
-          <a:schemeClr val="accent1">
-            <a:hueOff val="0"/>
-            <a:satOff val="0"/>
-            <a:lumOff val="0"/>
-            <a:alphaOff val="0"/>
-          </a:schemeClr>
-        </a:solidFill>
-        <a:ln w="12700" cap="flat" cmpd="sng" algn="ctr">
-          <a:solidFill>
-            <a:schemeClr val="lt1">
-              <a:hueOff val="0"/>
-              <a:satOff val="0"/>
-              <a:lumOff val="0"/>
-              <a:alphaOff val="0"/>
-            </a:schemeClr>
-          </a:solidFill>
-          <a:prstDash val="solid"/>
-          <a:miter lim="800000"/>
-        </a:ln>
-        <a:effectLst/>
-      </dsp:spPr>
-      <dsp:style>
-        <a:lnRef idx="2">
-          <a:scrgbClr r="0" g="0" b="0"/>
-        </a:lnRef>
-        <a:fillRef idx="1">
-          <a:scrgbClr r="0" g="0" b="0"/>
-        </a:fillRef>
-        <a:effectRef idx="0">
-          <a:scrgbClr r="0" g="0" b="0"/>
-        </a:effectRef>
-        <a:fontRef idx="minor">
-          <a:schemeClr val="lt1"/>
-        </a:fontRef>
-      </dsp:style>
-      <dsp:txBody>
-        <a:bodyPr spcFirstLastPara="0" vert="horz" wrap="square" lIns="9525" tIns="9525" rIns="9525" bIns="9525" numCol="1" spcCol="1270" anchor="ctr" anchorCtr="0">
-          <a:noAutofit/>
-        </a:bodyPr>
-        <a:lstStyle/>
-        <a:p>
-          <a:pPr marL="0" lvl="0" indent="0" algn="ctr" defTabSz="666750">
-            <a:lnSpc>
-              <a:spcPct val="90000"/>
-            </a:lnSpc>
-            <a:spcBef>
-              <a:spcPct val="0"/>
-            </a:spcBef>
-            <a:spcAft>
-              <a:spcPct val="35000"/>
-            </a:spcAft>
-            <a:buNone/>
-          </a:pPr>
-          <a:r>
-            <a:rPr lang="hu-HU" sz="1500" kern="1200"/>
-            <a:t>Logo component</a:t>
-          </a:r>
-        </a:p>
-      </dsp:txBody>
-      <dsp:txXfrm>
-        <a:off x="735748" y="441456"/>
-        <a:ext cx="1456524" cy="444062"/>
-      </dsp:txXfrm>
-    </dsp:sp>
-    <dsp:sp modelId="{899584F5-6BEA-409F-A46E-E06620EDDC06}">
-      <dsp:nvSpPr>
-        <dsp:cNvPr id="0" name=""/>
-        <dsp:cNvSpPr/>
-      </dsp:nvSpPr>
-      <dsp:spPr>
-        <a:xfrm>
           <a:off x="735748" y="996533"/>
           <a:ext cx="1456524" cy="444062"/>
         </a:xfrm>
@@ -2709,90 +2290,12 @@
           </a:pPr>
           <a:r>
             <a:rPr lang="hu-HU" sz="1500" kern="1200"/>
-            <a:t>menu component</a:t>
+            <a:t>Nav component</a:t>
           </a:r>
         </a:p>
       </dsp:txBody>
       <dsp:txXfrm>
         <a:off x="735748" y="996533"/>
-        <a:ext cx="1456524" cy="444062"/>
-      </dsp:txXfrm>
-    </dsp:sp>
-    <dsp:sp modelId="{C852B576-2FDC-4FCF-B74B-D2A846C1387C}">
-      <dsp:nvSpPr>
-        <dsp:cNvPr id="0" name=""/>
-        <dsp:cNvSpPr/>
-      </dsp:nvSpPr>
-      <dsp:spPr>
-        <a:xfrm>
-          <a:off x="735748" y="1551611"/>
-          <a:ext cx="1456524" cy="444062"/>
-        </a:xfrm>
-        <a:prstGeom prst="rect">
-          <a:avLst/>
-        </a:prstGeom>
-        <a:solidFill>
-          <a:schemeClr val="accent1">
-            <a:hueOff val="0"/>
-            <a:satOff val="0"/>
-            <a:lumOff val="0"/>
-            <a:alphaOff val="0"/>
-          </a:schemeClr>
-        </a:solidFill>
-        <a:ln w="12700" cap="flat" cmpd="sng" algn="ctr">
-          <a:solidFill>
-            <a:schemeClr val="lt1">
-              <a:hueOff val="0"/>
-              <a:satOff val="0"/>
-              <a:lumOff val="0"/>
-              <a:alphaOff val="0"/>
-            </a:schemeClr>
-          </a:solidFill>
-          <a:prstDash val="solid"/>
-          <a:miter lim="800000"/>
-        </a:ln>
-        <a:effectLst/>
-      </dsp:spPr>
-      <dsp:style>
-        <a:lnRef idx="2">
-          <a:scrgbClr r="0" g="0" b="0"/>
-        </a:lnRef>
-        <a:fillRef idx="1">
-          <a:scrgbClr r="0" g="0" b="0"/>
-        </a:fillRef>
-        <a:effectRef idx="0">
-          <a:scrgbClr r="0" g="0" b="0"/>
-        </a:effectRef>
-        <a:fontRef idx="minor">
-          <a:schemeClr val="lt1"/>
-        </a:fontRef>
-      </dsp:style>
-      <dsp:txBody>
-        <a:bodyPr spcFirstLastPara="0" vert="horz" wrap="square" lIns="9525" tIns="9525" rIns="9525" bIns="9525" numCol="1" spcCol="1270" anchor="ctr" anchorCtr="0">
-          <a:noAutofit/>
-        </a:bodyPr>
-        <a:lstStyle/>
-        <a:p>
-          <a:pPr marL="0" lvl="0" indent="0" algn="ctr" defTabSz="666750">
-            <a:lnSpc>
-              <a:spcPct val="90000"/>
-            </a:lnSpc>
-            <a:spcBef>
-              <a:spcPct val="0"/>
-            </a:spcBef>
-            <a:spcAft>
-              <a:spcPct val="35000"/>
-            </a:spcAft>
-            <a:buNone/>
-          </a:pPr>
-          <a:r>
-            <a:rPr lang="hu-HU" sz="1500" kern="1200"/>
-            <a:t>Buttons component</a:t>
-          </a:r>
-        </a:p>
-      </dsp:txBody>
-      <dsp:txXfrm>
-        <a:off x="735748" y="1551611"/>
         <a:ext cx="1456524" cy="444062"/>
       </dsp:txXfrm>
     </dsp:sp>

</xml_diff>